<commit_message>
improve publication figures and exports
</commit_message>
<xml_diff>
--- a/paper/manuscript/论文初稿_Journal_of_Agricultural_Engineering.docx
+++ b/paper/manuscript/论文初稿_Journal_of_Agricultural_Engineering.docx
@@ -296,6 +296,11 @@
     <w:p>
       <w:r>
         <w:t>The weather file is parsed by date, sentinel values are converted to missing values, and gaps of up to three days are linearly interpolated before feature construction. The sample generator fixes the NumPy random seed at 42. Soil scenarios are bounded to 2-95% during generation, while runtime validation accepts only a measured moisture value in the physical 0-100% range. All feature names, target names, split years, model hyperparameters and metric calculations are stored in the training script and the model metrics JSON. This makes the reported numbers reproducible from the repository without access to the live farm device.</w:t>
+      </w:r>
+    </w:p>
+    <w:p>
+      <w:r>
+        <w:t>Scientific figures were redesigned and export-audited using the Scientific Agent Skills visualization workflow (Kassis et al., 2026). The plotted values remain direct outputs of the repository data, fitted model and controller simulations; the workflow was used only for visual encoding, accessibility, physical sizing and multi-format export. Each figure is accompanied by a machine-readable export manifest.</w:t>
       </w:r>
     </w:p>
     <w:p>
@@ -744,6 +749,11 @@
     <w:p>
       <w:r>
         <w:t>Kamilaris A, Prenafeta-Boldu FX, 2018. Deep learning in agriculture: a survey. Comput Electron Agric 147:70-90. https://doi.org/10.1016/j.compag.2018.02.016</w:t>
+      </w:r>
+    </w:p>
+    <w:p>
+      <w:r>
+        <w:t>Kassis T, Agarwal V, He Y, Patel D, Brueckner AM, 2026. Scientific Agent Skills: a library of procedural knowledge for research agents. arXiv:2609.00065. https://doi.org/10.48550/arXiv.2609.00065</w:t>
       </w:r>
     </w:p>
     <w:p>
@@ -7134,8 +7144,8 @@
       <w:r>
         <w:drawing>
           <wp:inline xmlns:a="http://schemas.openxmlformats.org/drawingml/2006/main" xmlns:pic="http://schemas.openxmlformats.org/drawingml/2006/picture">
-            <wp:extent cx="5669280" cy="2968662"/>
-            <wp:docPr id="1" name="Picture 1"/>
+            <wp:extent cx="5669280" cy="2668727"/>
+            <wp:docPr id="1" name="Picture 1" descr="Figure 1. ZhiRun edge-cloud fertigation architecture. Boxes identify the field sensing, edge acquisition, server inference and ESP32-S3 actuation layers; arrows show the implemented communication paths."/>
             <wp:cNvGraphicFramePr>
               <a:graphicFrameLocks noChangeAspect="1"/>
             </wp:cNvGraphicFramePr>
@@ -7155,7 +7165,7 @@
                   <pic:spPr>
                     <a:xfrm>
                       <a:off x="0" y="0"/>
-                      <a:ext cx="5669280" cy="2968662"/>
+                      <a:ext cx="5669280" cy="2668727"/>
                     </a:xfrm>
                     <a:prstGeom prst="rect"/>
                   </pic:spPr>
@@ -7178,8 +7188,8 @@
       <w:r>
         <w:drawing>
           <wp:inline xmlns:a="http://schemas.openxmlformats.org/drawingml/2006/main" xmlns:pic="http://schemas.openxmlformats.org/drawingml/2006/picture">
-            <wp:extent cx="5669280" cy="4041736"/>
-            <wp:docPr id="2" name="Picture 2"/>
+            <wp:extent cx="5669280" cy="3854828"/>
+            <wp:docPr id="2" name="Picture 2" descr="Figure 2. Dataset composition and target sparsity. Panels show crop representation, positive target rates, the chronological split, and non-zero target magnitudes; n = 39,600."/>
             <wp:cNvGraphicFramePr>
               <a:graphicFrameLocks noChangeAspect="1"/>
             </wp:cNvGraphicFramePr>
@@ -7199,7 +7209,7 @@
                   <pic:spPr>
                     <a:xfrm>
                       <a:off x="0" y="0"/>
-                      <a:ext cx="5669280" cy="4041736"/>
+                      <a:ext cx="5669280" cy="3854828"/>
                     </a:xfrm>
                     <a:prstGeom prst="rect"/>
                   </pic:spPr>
@@ -7222,8 +7232,8 @@
       <w:r>
         <w:drawing>
           <wp:inline xmlns:a="http://schemas.openxmlformats.org/drawingml/2006/main" xmlns:pic="http://schemas.openxmlformats.org/drawingml/2006/picture">
-            <wp:extent cx="5669280" cy="4971761"/>
-            <wp:docPr id="3" name="Picture 3"/>
+            <wp:extent cx="5669280" cy="4744404"/>
+            <wp:docPr id="3" name="Picture 3" descr="Figure 3. Independent test parity plots for water, N, P2O5 and K2O targets. Hexbin density is shown for n = 7,200 held-out rows; dashed lines are 1:1 references."/>
             <wp:cNvGraphicFramePr>
               <a:graphicFrameLocks noChangeAspect="1"/>
             </wp:cNvGraphicFramePr>
@@ -7243,7 +7253,7 @@
                   <pic:spPr>
                     <a:xfrm>
                       <a:off x="0" y="0"/>
-                      <a:ext cx="5669280" cy="4971761"/>
+                      <a:ext cx="5669280" cy="4744404"/>
                     </a:xfrm>
                     <a:prstGeom prst="rect"/>
                   </pic:spPr>
@@ -7266,8 +7276,8 @@
       <w:r>
         <w:drawing>
           <wp:inline xmlns:a="http://schemas.openxmlformats.org/drawingml/2006/main" xmlns:pic="http://schemas.openxmlformats.org/drawingml/2006/picture">
-            <wp:extent cx="5669280" cy="4429246"/>
-            <wp:docPr id="4" name="Picture 4"/>
+            <wp:extent cx="5669280" cy="4024271"/>
+            <wp:docPr id="4" name="Picture 4" descr="Figure 4. Temporal, crop-level and positive-event robustness. Results are computed from the stored model and held-out rows; no field-yield labels are used."/>
             <wp:cNvGraphicFramePr>
               <a:graphicFrameLocks noChangeAspect="1"/>
             </wp:cNvGraphicFramePr>
@@ -7287,7 +7297,7 @@
                   <pic:spPr>
                     <a:xfrm>
                       <a:off x="0" y="0"/>
-                      <a:ext cx="5669280" cy="4429246"/>
+                      <a:ext cx="5669280" cy="4024271"/>
                     </a:xfrm>
                     <a:prstGeom prst="rect"/>
                   </pic:spPr>
@@ -7310,8 +7320,8 @@
       <w:r>
         <w:drawing>
           <wp:inline xmlns:a="http://schemas.openxmlformats.org/drawingml/2006/main" xmlns:pic="http://schemas.openxmlformats.org/drawingml/2006/picture">
-            <wp:extent cx="5669280" cy="3650822"/>
-            <wp:docPr id="5" name="Picture 5"/>
+            <wp:extent cx="5669280" cy="2372202"/>
+            <wp:docPr id="5" name="Picture 5" descr="Figure 5. Deterministic controller timing trace. Fertilizer channels close on their own flow-meter targets before the outlet pump is released."/>
             <wp:cNvGraphicFramePr>
               <a:graphicFrameLocks noChangeAspect="1"/>
             </wp:cNvGraphicFramePr>
@@ -7331,7 +7341,7 @@
                   <pic:spPr>
                     <a:xfrm>
                       <a:off x="0" y="0"/>
-                      <a:ext cx="5669280" cy="3650822"/>
+                      <a:ext cx="5669280" cy="2372202"/>
                     </a:xfrm>
                     <a:prstGeom prst="rect"/>
                   </pic:spPr>
@@ -7354,8 +7364,8 @@
       <w:r>
         <w:drawing>
           <wp:inline xmlns:a="http://schemas.openxmlformats.org/drawingml/2006/main" xmlns:pic="http://schemas.openxmlformats.org/drawingml/2006/picture">
-            <wp:extent cx="5669280" cy="2960831"/>
-            <wp:docPr id="6" name="Picture 6"/>
+            <wp:extent cx="5669280" cy="3515942"/>
+            <wp:docPr id="6" name="Picture 6" descr="Figure 6. Bootstrap sampling uncertainty for independent-test MAE. Points are bootstrap means and bars are 95% percentile intervals from 1,000 resamples."/>
             <wp:cNvGraphicFramePr>
               <a:graphicFrameLocks noChangeAspect="1"/>
             </wp:cNvGraphicFramePr>
@@ -7375,7 +7385,7 @@
                   <pic:spPr>
                     <a:xfrm>
                       <a:off x="0" y="0"/>
-                      <a:ext cx="5669280" cy="2960831"/>
+                      <a:ext cx="5669280" cy="3515942"/>
                     </a:xfrm>
                     <a:prstGeom prst="rect"/>
                   </pic:spPr>

</xml_diff>